<commit_message>
Reword the README, table titles and notes
</commit_message>
<xml_diff>
--- a/experiments/tables/tables.docx
+++ b/experiments/tables/tables.docx
@@ -23,7 +23,7 @@
         <w:rPr>
           <w:b/>
         </w:rPr>
-        <w:t>T01. Volatility forecasts of the nine models</w:t>
+        <w:t>T01. How well each of the nine models forecast silver's volatility</w:t>
       </w:r>
     </w:p>
     <w:tbl>
@@ -64,7 +64,7 @@
               <w:rPr>
                 <w:b/>
               </w:rPr>
-              <w:t>QLIKE 1d</w:t>
+              <w:t>QLIKE (1-day)</w:t>
             </w:r>
           </w:p>
         </w:tc>
@@ -77,7 +77,7 @@
               <w:rPr>
                 <w:b/>
               </w:rPr>
-              <w:t>QLIKE 5d</w:t>
+              <w:t>QLIKE (5-day)</w:t>
             </w:r>
           </w:p>
         </w:tc>
@@ -90,7 +90,7 @@
               <w:rPr>
                 <w:b/>
               </w:rPr>
-              <w:t>RMSE 1d</w:t>
+              <w:t>RMSE (1-day)</w:t>
             </w:r>
           </w:p>
         </w:tc>
@@ -103,7 +103,7 @@
               <w:rPr>
                 <w:b/>
               </w:rPr>
-              <w:t>RMSE 5d</w:t>
+              <w:t>RMSE (5-day)</w:t>
             </w:r>
           </w:p>
         </w:tc>
@@ -116,7 +116,7 @@
               <w:rPr>
                 <w:b/>
               </w:rPr>
-              <w:t>MZ R² 1d</w:t>
+              <w:t>MZ R² (1-day)</w:t>
             </w:r>
           </w:p>
         </w:tc>
@@ -129,7 +129,7 @@
               <w:rPr>
                 <w:b/>
               </w:rPr>
-              <w:t>MZ R² 5d</w:t>
+              <w:t>MZ R² (5-day)</w:t>
             </w:r>
           </w:p>
         </w:tc>
@@ -1140,7 +1140,7 @@
           <w:i/>
           <w:sz w:val="16"/>
         </w:rPr>
-        <w:t>Test period 4 Jan 2010 – 23 Jun 2026, 4,141 days, 8 folds, monthly refits. QLIKE and RMSE: lower is better; MZ R²: higher is better. Best value per column in bold. Source: phase4-aimdg/scoreboard.csv.</w:t>
+        <w:t>Scored over the 4,141 trading days from 4 Jan 2010 to 23 Jun 2026 (eight folds, refitted monthly). Smaller QLIKE and RMSE are better, a larger Mincer–Zarnowitz R² is better; bold marks the leader of each column, ties included. Source: phase4-aimdg/scoreboard.csv.</w:t>
       </w:r>
     </w:p>
     <w:p>
@@ -1151,7 +1151,7 @@
         <w:rPr>
           <w:b/>
         </w:rPr>
-        <w:t>T02. Direction forecasts of the nine models, 1-day horizon</w:t>
+        <w:t>T02. How well each model called the direction of silver 1 trading day ahead</w:t>
       </w:r>
     </w:p>
     <w:tbl>
@@ -1194,7 +1194,7 @@
               <w:rPr>
                 <w:b/>
               </w:rPr>
-              <w:t>Brier</w:t>
+              <w:t>Brier score</w:t>
             </w:r>
           </w:p>
         </w:tc>
@@ -1207,7 +1207,7 @@
               <w:rPr>
                 <w:b/>
               </w:rPr>
-              <w:t>Log-loss</w:t>
+              <w:t>Log loss</w:t>
             </w:r>
           </w:p>
         </w:tc>
@@ -1233,7 +1233,7 @@
               <w:rPr>
                 <w:b/>
               </w:rPr>
-              <w:t>Hit rate</w:t>
+              <w:t>Accuracy</w:t>
             </w:r>
           </w:p>
         </w:tc>
@@ -1246,7 +1246,7 @@
               <w:rPr>
                 <w:b/>
               </w:rPr>
-              <w:t>Balanced</w:t>
+              <w:t>Balanced accuracy</w:t>
             </w:r>
           </w:p>
         </w:tc>
@@ -1259,7 +1259,7 @@
               <w:rPr>
                 <w:b/>
               </w:rPr>
-              <w:t>Up calls</w:t>
+              <w:t>Share called up</w:t>
             </w:r>
           </w:p>
         </w:tc>
@@ -1272,7 +1272,7 @@
               <w:rPr>
                 <w:b/>
               </w:rPr>
-              <w:t>Up right</w:t>
+              <w:t>Up calls correct</w:t>
             </w:r>
           </w:p>
         </w:tc>
@@ -1285,7 +1285,7 @@
               <w:rPr>
                 <w:b/>
               </w:rPr>
-              <w:t>Down right</w:t>
+              <w:t>Down calls correct</w:t>
             </w:r>
           </w:p>
         </w:tc>
@@ -2584,7 +2584,7 @@
           <w:i/>
           <w:sz w:val="16"/>
         </w:rPr>
-        <w:t>Test period 4 Jan 2010 – 23 Jun 2026, 4,141 days, 8 folds, monthly refits. Up calls: share of days called up. Up right / Down right: share of each side's calls that were correct. Best value per column in bold. Source: phase4-aimdg/scoreboard.csv.</w:t>
+        <w:t>Scored over the 4,141 trading days from 4 Jan 2010 to 23 Jun 2026 (eight folds, refitted monthly). 'Share called up' is how often the model predicted a rise; the two 'calls correct' columns show how often each kind of call came true. Bold marks the leader of each column. Source: phase4-aimdg/scoreboard.csv.</w:t>
       </w:r>
     </w:p>
     <w:p>
@@ -2595,7 +2595,7 @@
         <w:rPr>
           <w:b/>
         </w:rPr>
-        <w:t>T03. Direction forecasts of the nine models, 5-day horizon</w:t>
+        <w:t>T03. How well each model called the direction of silver 5 trading days ahead</w:t>
       </w:r>
     </w:p>
     <w:tbl>
@@ -2638,7 +2638,7 @@
               <w:rPr>
                 <w:b/>
               </w:rPr>
-              <w:t>Brier</w:t>
+              <w:t>Brier score</w:t>
             </w:r>
           </w:p>
         </w:tc>
@@ -2651,7 +2651,7 @@
               <w:rPr>
                 <w:b/>
               </w:rPr>
-              <w:t>Log-loss</w:t>
+              <w:t>Log loss</w:t>
             </w:r>
           </w:p>
         </w:tc>
@@ -2677,7 +2677,7 @@
               <w:rPr>
                 <w:b/>
               </w:rPr>
-              <w:t>Hit rate</w:t>
+              <w:t>Accuracy</w:t>
             </w:r>
           </w:p>
         </w:tc>
@@ -2690,7 +2690,7 @@
               <w:rPr>
                 <w:b/>
               </w:rPr>
-              <w:t>Balanced</w:t>
+              <w:t>Balanced accuracy</w:t>
             </w:r>
           </w:p>
         </w:tc>
@@ -2703,7 +2703,7 @@
               <w:rPr>
                 <w:b/>
               </w:rPr>
-              <w:t>Up calls</w:t>
+              <w:t>Share called up</w:t>
             </w:r>
           </w:p>
         </w:tc>
@@ -2716,7 +2716,7 @@
               <w:rPr>
                 <w:b/>
               </w:rPr>
-              <w:t>Up right</w:t>
+              <w:t>Up calls correct</w:t>
             </w:r>
           </w:p>
         </w:tc>
@@ -2729,7 +2729,7 @@
               <w:rPr>
                 <w:b/>
               </w:rPr>
-              <w:t>Down right</w:t>
+              <w:t>Down calls correct</w:t>
             </w:r>
           </w:p>
         </w:tc>
@@ -4028,7 +4028,7 @@
           <w:i/>
           <w:sz w:val="16"/>
         </w:rPr>
-        <w:t>Test period 4 Jan 2010 – 23 Jun 2026, 4,141 days, 8 folds, monthly refits. Up calls: share of days called up. Up right / Down right: share of each side's calls that were correct. Best value per column in bold. Source: phase4-aimdg/scoreboard.csv.</w:t>
+        <w:t>Scored over the 4,141 trading days from 4 Jan 2010 to 23 Jun 2026 (eight folds, refitted monthly). 'Share called up' is how often the model predicted a rise; the two 'calls correct' columns show how often each kind of call came true. Bold marks the leader of each column. Source: phase4-aimdg/scoreboard.csv.</w:t>
       </w:r>
     </w:p>
     <w:p>
@@ -4039,7 +4039,7 @@
         <w:rPr>
           <w:b/>
         </w:rPr>
-        <w:t>T04. QLIKE: every model against climatology</w:t>
+        <w:t>T04. Each model compared with climatology on QLIKE</w:t>
       </w:r>
     </w:p>
     <w:tbl>
@@ -4084,7 +4084,7 @@
               <w:rPr>
                 <w:b/>
               </w:rPr>
-              <w:t>Diff 1d</w:t>
+              <w:t>Mean diff. (1-day)</w:t>
             </w:r>
           </w:p>
         </w:tc>
@@ -4097,7 +4097,7 @@
               <w:rPr>
                 <w:b/>
               </w:rPr>
-              <w:t>DM p 1d</w:t>
+              <w:t>p DM (1-day)</w:t>
             </w:r>
           </w:p>
         </w:tc>
@@ -4110,7 +4110,7 @@
               <w:rPr>
                 <w:b/>
               </w:rPr>
-              <w:t>Wilcoxon p 1d</w:t>
+              <w:t>p Wilcoxon (1-day)</w:t>
             </w:r>
           </w:p>
         </w:tc>
@@ -4123,7 +4123,7 @@
               <w:rPr>
                 <w:b/>
               </w:rPr>
-              <w:t>Perm. p 1d</w:t>
+              <w:t>p permutation (1-day)</w:t>
             </w:r>
           </w:p>
         </w:tc>
@@ -4136,7 +4136,7 @@
               <w:rPr>
                 <w:b/>
               </w:rPr>
-              <w:t>Folds 1d</w:t>
+              <w:t>Folds won (1-day)</w:t>
             </w:r>
           </w:p>
         </w:tc>
@@ -4149,7 +4149,7 @@
               <w:rPr>
                 <w:b/>
               </w:rPr>
-              <w:t>Diff 5d</w:t>
+              <w:t>Mean diff. (5-day)</w:t>
             </w:r>
           </w:p>
         </w:tc>
@@ -4162,7 +4162,7 @@
               <w:rPr>
                 <w:b/>
               </w:rPr>
-              <w:t>DM p 5d</w:t>
+              <w:t>p DM (5-day)</w:t>
             </w:r>
           </w:p>
         </w:tc>
@@ -4175,7 +4175,7 @@
               <w:rPr>
                 <w:b/>
               </w:rPr>
-              <w:t>Wilcoxon p 5d</w:t>
+              <w:t>p Wilcoxon (5-day)</w:t>
             </w:r>
           </w:p>
         </w:tc>
@@ -4188,7 +4188,7 @@
               <w:rPr>
                 <w:b/>
               </w:rPr>
-              <w:t>Perm. p 5d</w:t>
+              <w:t>p permutation (5-day)</w:t>
             </w:r>
           </w:p>
         </w:tc>
@@ -4201,7 +4201,7 @@
               <w:rPr>
                 <w:b/>
               </w:rPr>
-              <w:t>Folds 5d</w:t>
+              <w:t>Folds won (5-day)</w:t>
             </w:r>
           </w:p>
         </w:tc>
@@ -5613,7 +5613,7 @@
           <w:i/>
           <w:sz w:val="16"/>
         </w:rPr>
-        <w:t>Difference: mean loss of the model minus the reference's; negative means the model is better. DM: Diebold–Mariano on the 4,141 daily losses; Wilcoxon: signed-rank over the 8 fold means; Perm.: block permutation (21-day blocks). * p &lt; 0.05. Folds: folds in which the model beat the reference. Source: phase4-aimdg/significance.csv.</w:t>
+        <w:t>A negative mean difference says the model's average loss was lower than the reference's. p DM comes from the Diebold–Mariano test on all 4,141 daily losses, p Wilcoxon from a signed-rank test on the eight per-fold averages, and p permutation from flipping signs in blocks of 21 days. A star marks p below 0.05. 'Folds won' says in how many of the eight folds the model came out ahead. Source: phase4-aimdg/significance.csv.</w:t>
       </w:r>
     </w:p>
     <w:p>
@@ -5624,7 +5624,7 @@
         <w:rPr>
           <w:b/>
         </w:rPr>
-        <w:t>T05. Brier: every model against climatology</w:t>
+        <w:t>T05. Each model compared with climatology on Brier</w:t>
       </w:r>
     </w:p>
     <w:tbl>
@@ -5669,7 +5669,7 @@
               <w:rPr>
                 <w:b/>
               </w:rPr>
-              <w:t>Diff 1d</w:t>
+              <w:t>Mean diff. (1-day)</w:t>
             </w:r>
           </w:p>
         </w:tc>
@@ -5682,7 +5682,7 @@
               <w:rPr>
                 <w:b/>
               </w:rPr>
-              <w:t>DM p 1d</w:t>
+              <w:t>p DM (1-day)</w:t>
             </w:r>
           </w:p>
         </w:tc>
@@ -5695,7 +5695,7 @@
               <w:rPr>
                 <w:b/>
               </w:rPr>
-              <w:t>Wilcoxon p 1d</w:t>
+              <w:t>p Wilcoxon (1-day)</w:t>
             </w:r>
           </w:p>
         </w:tc>
@@ -5708,7 +5708,7 @@
               <w:rPr>
                 <w:b/>
               </w:rPr>
-              <w:t>Perm. p 1d</w:t>
+              <w:t>p permutation (1-day)</w:t>
             </w:r>
           </w:p>
         </w:tc>
@@ -5721,7 +5721,7 @@
               <w:rPr>
                 <w:b/>
               </w:rPr>
-              <w:t>Folds 1d</w:t>
+              <w:t>Folds won (1-day)</w:t>
             </w:r>
           </w:p>
         </w:tc>
@@ -5734,7 +5734,7 @@
               <w:rPr>
                 <w:b/>
               </w:rPr>
-              <w:t>Diff 5d</w:t>
+              <w:t>Mean diff. (5-day)</w:t>
             </w:r>
           </w:p>
         </w:tc>
@@ -5747,7 +5747,7 @@
               <w:rPr>
                 <w:b/>
               </w:rPr>
-              <w:t>DM p 5d</w:t>
+              <w:t>p DM (5-day)</w:t>
             </w:r>
           </w:p>
         </w:tc>
@@ -5760,7 +5760,7 @@
               <w:rPr>
                 <w:b/>
               </w:rPr>
-              <w:t>Wilcoxon p 5d</w:t>
+              <w:t>p Wilcoxon (5-day)</w:t>
             </w:r>
           </w:p>
         </w:tc>
@@ -5773,7 +5773,7 @@
               <w:rPr>
                 <w:b/>
               </w:rPr>
-              <w:t>Perm. p 5d</w:t>
+              <w:t>p permutation (5-day)</w:t>
             </w:r>
           </w:p>
         </w:tc>
@@ -5786,7 +5786,7 @@
               <w:rPr>
                 <w:b/>
               </w:rPr>
-              <w:t>Folds 5d</w:t>
+              <w:t>Folds won (5-day)</w:t>
             </w:r>
           </w:p>
         </w:tc>
@@ -7198,7 +7198,7 @@
           <w:i/>
           <w:sz w:val="16"/>
         </w:rPr>
-        <w:t>Difference: mean loss of the model minus the reference's; negative means the model is better. DM: Diebold–Mariano on the 4,141 daily losses; Wilcoxon: signed-rank over the 8 fold means; Perm.: block permutation (21-day blocks). * p &lt; 0.05. Folds: folds in which the model beat the reference. Source: phase4-aimdg/significance.csv.</w:t>
+        <w:t>A negative mean difference says the model's average loss was lower than the reference's. p DM comes from the Diebold–Mariano test on all 4,141 daily losses, p Wilcoxon from a signed-rank test on the eight per-fold averages, and p permutation from flipping signs in blocks of 21 days. A star marks p below 0.05. 'Folds won' says in how many of the eight folds the model came out ahead. Source: phase4-aimdg/significance.csv.</w:t>
       </w:r>
     </w:p>
     <w:p>
@@ -7209,7 +7209,7 @@
         <w:rPr>
           <w:b/>
         </w:rPr>
-        <w:t>T06. Log-loss: every model against climatology</w:t>
+        <w:t>T06. Each model compared with climatology on Log-loss</w:t>
       </w:r>
     </w:p>
     <w:tbl>
@@ -7254,7 +7254,7 @@
               <w:rPr>
                 <w:b/>
               </w:rPr>
-              <w:t>Diff 1d</w:t>
+              <w:t>Mean diff. (1-day)</w:t>
             </w:r>
           </w:p>
         </w:tc>
@@ -7267,7 +7267,7 @@
               <w:rPr>
                 <w:b/>
               </w:rPr>
-              <w:t>DM p 1d</w:t>
+              <w:t>p DM (1-day)</w:t>
             </w:r>
           </w:p>
         </w:tc>
@@ -7280,7 +7280,7 @@
               <w:rPr>
                 <w:b/>
               </w:rPr>
-              <w:t>Wilcoxon p 1d</w:t>
+              <w:t>p Wilcoxon (1-day)</w:t>
             </w:r>
           </w:p>
         </w:tc>
@@ -7293,7 +7293,7 @@
               <w:rPr>
                 <w:b/>
               </w:rPr>
-              <w:t>Perm. p 1d</w:t>
+              <w:t>p permutation (1-day)</w:t>
             </w:r>
           </w:p>
         </w:tc>
@@ -7306,7 +7306,7 @@
               <w:rPr>
                 <w:b/>
               </w:rPr>
-              <w:t>Folds 1d</w:t>
+              <w:t>Folds won (1-day)</w:t>
             </w:r>
           </w:p>
         </w:tc>
@@ -7319,7 +7319,7 @@
               <w:rPr>
                 <w:b/>
               </w:rPr>
-              <w:t>Diff 5d</w:t>
+              <w:t>Mean diff. (5-day)</w:t>
             </w:r>
           </w:p>
         </w:tc>
@@ -7332,7 +7332,7 @@
               <w:rPr>
                 <w:b/>
               </w:rPr>
-              <w:t>DM p 5d</w:t>
+              <w:t>p DM (5-day)</w:t>
             </w:r>
           </w:p>
         </w:tc>
@@ -7345,7 +7345,7 @@
               <w:rPr>
                 <w:b/>
               </w:rPr>
-              <w:t>Wilcoxon p 5d</w:t>
+              <w:t>p Wilcoxon (5-day)</w:t>
             </w:r>
           </w:p>
         </w:tc>
@@ -7358,7 +7358,7 @@
               <w:rPr>
                 <w:b/>
               </w:rPr>
-              <w:t>Perm. p 5d</w:t>
+              <w:t>p permutation (5-day)</w:t>
             </w:r>
           </w:p>
         </w:tc>
@@ -7371,7 +7371,7 @@
               <w:rPr>
                 <w:b/>
               </w:rPr>
-              <w:t>Folds 5d</w:t>
+              <w:t>Folds won (5-day)</w:t>
             </w:r>
           </w:p>
         </w:tc>
@@ -8783,7 +8783,7 @@
           <w:i/>
           <w:sz w:val="16"/>
         </w:rPr>
-        <w:t>Difference: mean loss of the model minus the reference's; negative means the model is better. DM: Diebold–Mariano on the 4,141 daily losses; Wilcoxon: signed-rank over the 8 fold means; Perm.: block permutation (21-day blocks). * p &lt; 0.05. Folds: folds in which the model beat the reference. Source: phase4-aimdg/significance.csv.</w:t>
+        <w:t>A negative mean difference says the model's average loss was lower than the reference's. p DM comes from the Diebold–Mariano test on all 4,141 daily losses, p Wilcoxon from a signed-rank test on the eight per-fold averages, and p permutation from flipping signs in blocks of 21 days. A star marks p below 0.05. 'Folds won' says in how many of the eight folds the model came out ahead. Source: phase4-aimdg/significance.csv.</w:t>
       </w:r>
     </w:p>
     <w:p>
@@ -8794,7 +8794,7 @@
         <w:rPr>
           <w:b/>
         </w:rPr>
-        <w:t>T07. AIM-DG against the static graph (the main hypothesis test)</w:t>
+        <w:t>T07. Does AIM-DG beat the graph that keeps every edge? All scores, both horizons</w:t>
       </w:r>
     </w:p>
     <w:tbl>
@@ -8823,7 +8823,7 @@
               <w:rPr>
                 <w:b/>
               </w:rPr>
-              <w:t>Loss</w:t>
+              <w:t>Score</w:t>
             </w:r>
           </w:p>
         </w:tc>
@@ -8836,7 +8836,7 @@
               <w:rPr>
                 <w:b/>
               </w:rPr>
-              <w:t>Horizon</w:t>
+              <w:t>Days ahead</w:t>
             </w:r>
           </w:p>
         </w:tc>
@@ -8849,7 +8849,7 @@
               <w:rPr>
                 <w:b/>
               </w:rPr>
-              <w:t>Difference</w:t>
+              <w:t>Mean difference</w:t>
             </w:r>
           </w:p>
         </w:tc>
@@ -8862,7 +8862,7 @@
               <w:rPr>
                 <w:b/>
               </w:rPr>
-              <w:t>DM statistic</w:t>
+              <w:t>DM stat</w:t>
             </w:r>
           </w:p>
         </w:tc>
@@ -8875,7 +8875,7 @@
               <w:rPr>
                 <w:b/>
               </w:rPr>
-              <w:t>DM p</w:t>
+              <w:t>p (DM)</w:t>
             </w:r>
           </w:p>
         </w:tc>
@@ -8888,7 +8888,7 @@
               <w:rPr>
                 <w:b/>
               </w:rPr>
-              <w:t>Wilcoxon p</w:t>
+              <w:t>p (Wilcoxon)</w:t>
             </w:r>
           </w:p>
         </w:tc>
@@ -8901,7 +8901,7 @@
               <w:rPr>
                 <w:b/>
               </w:rPr>
-              <w:t>Permutation p</w:t>
+              <w:t>p (permutation)</w:t>
             </w:r>
           </w:p>
         </w:tc>
@@ -8914,7 +8914,7 @@
               <w:rPr>
                 <w:b/>
               </w:rPr>
-              <w:t>Folds better</w:t>
+              <w:t>Folds won</w:t>
             </w:r>
           </w:p>
         </w:tc>
@@ -8945,7 +8945,7 @@
               <w:rPr>
                 <w:b w:val="0"/>
               </w:rPr>
-              <w:t>1 day</w:t>
+              <w:t>1</w:t>
             </w:r>
           </w:p>
         </w:tc>
@@ -9072,7 +9072,7 @@
               <w:rPr>
                 <w:b w:val="0"/>
               </w:rPr>
-              <w:t>5 days</w:t>
+              <w:t>5</w:t>
             </w:r>
           </w:p>
         </w:tc>
@@ -9199,7 +9199,7 @@
               <w:rPr>
                 <w:b w:val="0"/>
               </w:rPr>
-              <w:t>1 day</w:t>
+              <w:t>1</w:t>
             </w:r>
           </w:p>
         </w:tc>
@@ -9326,7 +9326,7 @@
               <w:rPr>
                 <w:b w:val="0"/>
               </w:rPr>
-              <w:t>5 days</w:t>
+              <w:t>5</w:t>
             </w:r>
           </w:p>
         </w:tc>
@@ -9453,7 +9453,7 @@
               <w:rPr>
                 <w:b w:val="0"/>
               </w:rPr>
-              <w:t>1 day</w:t>
+              <w:t>1</w:t>
             </w:r>
           </w:p>
         </w:tc>
@@ -9580,7 +9580,7 @@
               <w:rPr>
                 <w:b w:val="0"/>
               </w:rPr>
-              <w:t>5 days</w:t>
+              <w:t>5</w:t>
             </w:r>
           </w:p>
         </w:tc>
@@ -9688,7 +9688,7 @@
           <w:i/>
           <w:sz w:val="16"/>
         </w:rPr>
-        <w:t>Difference: mean loss of AIM-DG minus the static graph's; negative means AIM-DG is better. DM: Diebold–Mariano on the 4,141 daily losses; Wilcoxon: signed-rank over the 8 fold means; Perm.: block permutation (21-day blocks). * p &lt; 0.05. Folds: folds in which AIM-DG beat the static graph. Source: phase4-aimdg-vs-static_gnn/significance.csv.</w:t>
+        <w:t>A negative mean difference says AIM-DG's average loss was lower than the static graph's. p DM comes from the Diebold–Mariano test on all 4,141 daily losses, p Wilcoxon from a signed-rank test on the eight per-fold averages, and p permutation from flipping signs in blocks of 21 days. A star marks p below 0.05. 'Folds won' says in how many of the eight folds AIM-DG came out ahead. Source: phase4-aimdg-vs-static_gnn/significance.csv.</w:t>
       </w:r>
     </w:p>
     <w:p>
@@ -9699,7 +9699,7 @@
         <w:rPr>
           <w:b/>
         </w:rPr>
-        <w:t>T08. QLIKE: every model against the static graph</w:t>
+        <w:t>T08. Each model compared with the static graph on QLIKE</w:t>
       </w:r>
     </w:p>
     <w:tbl>
@@ -9744,7 +9744,7 @@
               <w:rPr>
                 <w:b/>
               </w:rPr>
-              <w:t>Diff 1d</w:t>
+              <w:t>Mean diff. (1-day)</w:t>
             </w:r>
           </w:p>
         </w:tc>
@@ -9757,7 +9757,7 @@
               <w:rPr>
                 <w:b/>
               </w:rPr>
-              <w:t>DM p 1d</w:t>
+              <w:t>p DM (1-day)</w:t>
             </w:r>
           </w:p>
         </w:tc>
@@ -9770,7 +9770,7 @@
               <w:rPr>
                 <w:b/>
               </w:rPr>
-              <w:t>Wilcoxon p 1d</w:t>
+              <w:t>p Wilcoxon (1-day)</w:t>
             </w:r>
           </w:p>
         </w:tc>
@@ -9783,7 +9783,7 @@
               <w:rPr>
                 <w:b/>
               </w:rPr>
-              <w:t>Perm. p 1d</w:t>
+              <w:t>p permutation (1-day)</w:t>
             </w:r>
           </w:p>
         </w:tc>
@@ -9796,7 +9796,7 @@
               <w:rPr>
                 <w:b/>
               </w:rPr>
-              <w:t>Folds 1d</w:t>
+              <w:t>Folds won (1-day)</w:t>
             </w:r>
           </w:p>
         </w:tc>
@@ -9809,7 +9809,7 @@
               <w:rPr>
                 <w:b/>
               </w:rPr>
-              <w:t>Diff 5d</w:t>
+              <w:t>Mean diff. (5-day)</w:t>
             </w:r>
           </w:p>
         </w:tc>
@@ -9822,7 +9822,7 @@
               <w:rPr>
                 <w:b/>
               </w:rPr>
-              <w:t>DM p 5d</w:t>
+              <w:t>p DM (5-day)</w:t>
             </w:r>
           </w:p>
         </w:tc>
@@ -9835,7 +9835,7 @@
               <w:rPr>
                 <w:b/>
               </w:rPr>
-              <w:t>Wilcoxon p 5d</w:t>
+              <w:t>p Wilcoxon (5-day)</w:t>
             </w:r>
           </w:p>
         </w:tc>
@@ -9848,7 +9848,7 @@
               <w:rPr>
                 <w:b/>
               </w:rPr>
-              <w:t>Perm. p 5d</w:t>
+              <w:t>p permutation (5-day)</w:t>
             </w:r>
           </w:p>
         </w:tc>
@@ -9861,7 +9861,7 @@
               <w:rPr>
                 <w:b/>
               </w:rPr>
-              <w:t>Folds 5d</w:t>
+              <w:t>Folds won (5-day)</w:t>
             </w:r>
           </w:p>
         </w:tc>
@@ -11273,7 +11273,7 @@
           <w:i/>
           <w:sz w:val="16"/>
         </w:rPr>
-        <w:t>Difference: mean loss of the model minus the reference's; negative means the model is better. DM: Diebold–Mariano on the 4,141 daily losses; Wilcoxon: signed-rank over the 8 fold means; Perm.: block permutation (21-day blocks). * p &lt; 0.05. Folds: folds in which the model beat the reference. Source: phase4-aimdg-vs-static_gnn/significance.csv.</w:t>
+        <w:t>A negative mean difference says the model's average loss was lower than the reference's. p DM comes from the Diebold–Mariano test on all 4,141 daily losses, p Wilcoxon from a signed-rank test on the eight per-fold averages, and p permutation from flipping signs in blocks of 21 days. A star marks p below 0.05. 'Folds won' says in how many of the eight folds the model came out ahead. Source: phase4-aimdg-vs-static_gnn/significance.csv.</w:t>
       </w:r>
     </w:p>
     <w:p>
@@ -11284,7 +11284,7 @@
         <w:rPr>
           <w:b/>
         </w:rPr>
-        <w:t>T09. Brier: every model against gradient boosting</w:t>
+        <w:t>T09. Each model compared with gradient boosting on the Brier score</w:t>
       </w:r>
     </w:p>
     <w:tbl>
@@ -11329,7 +11329,7 @@
               <w:rPr>
                 <w:b/>
               </w:rPr>
-              <w:t>Diff 1d</w:t>
+              <w:t>Mean diff. (1-day)</w:t>
             </w:r>
           </w:p>
         </w:tc>
@@ -11342,7 +11342,7 @@
               <w:rPr>
                 <w:b/>
               </w:rPr>
-              <w:t>DM p 1d</w:t>
+              <w:t>p DM (1-day)</w:t>
             </w:r>
           </w:p>
         </w:tc>
@@ -11355,7 +11355,7 @@
               <w:rPr>
                 <w:b/>
               </w:rPr>
-              <w:t>Wilcoxon p 1d</w:t>
+              <w:t>p Wilcoxon (1-day)</w:t>
             </w:r>
           </w:p>
         </w:tc>
@@ -11368,7 +11368,7 @@
               <w:rPr>
                 <w:b/>
               </w:rPr>
-              <w:t>Perm. p 1d</w:t>
+              <w:t>p permutation (1-day)</w:t>
             </w:r>
           </w:p>
         </w:tc>
@@ -11381,7 +11381,7 @@
               <w:rPr>
                 <w:b/>
               </w:rPr>
-              <w:t>Folds 1d</w:t>
+              <w:t>Folds won (1-day)</w:t>
             </w:r>
           </w:p>
         </w:tc>
@@ -11394,7 +11394,7 @@
               <w:rPr>
                 <w:b/>
               </w:rPr>
-              <w:t>Diff 5d</w:t>
+              <w:t>Mean diff. (5-day)</w:t>
             </w:r>
           </w:p>
         </w:tc>
@@ -11407,7 +11407,7 @@
               <w:rPr>
                 <w:b/>
               </w:rPr>
-              <w:t>DM p 5d</w:t>
+              <w:t>p DM (5-day)</w:t>
             </w:r>
           </w:p>
         </w:tc>
@@ -11420,7 +11420,7 @@
               <w:rPr>
                 <w:b/>
               </w:rPr>
-              <w:t>Wilcoxon p 5d</w:t>
+              <w:t>p Wilcoxon (5-day)</w:t>
             </w:r>
           </w:p>
         </w:tc>
@@ -11433,7 +11433,7 @@
               <w:rPr>
                 <w:b/>
               </w:rPr>
-              <w:t>Perm. p 5d</w:t>
+              <w:t>p permutation (5-day)</w:t>
             </w:r>
           </w:p>
         </w:tc>
@@ -11446,7 +11446,7 @@
               <w:rPr>
                 <w:b/>
               </w:rPr>
-              <w:t>Folds 5d</w:t>
+              <w:t>Folds won (5-day)</w:t>
             </w:r>
           </w:p>
         </w:tc>
@@ -12858,7 +12858,7 @@
           <w:i/>
           <w:sz w:val="16"/>
         </w:rPr>
-        <w:t>Difference: mean loss of the model minus the reference's; negative means the model is better. DM: Diebold–Mariano on the 4,141 daily losses; Wilcoxon: signed-rank over the 8 fold means; Perm.: block permutation (21-day blocks). * p &lt; 0.05. Folds: folds in which the model beat the reference. Source: phase4-aimdg-vs-gbm/significance.csv.</w:t>
+        <w:t>A negative mean difference says the model's average loss was lower than the reference's. p DM comes from the Diebold–Mariano test on all 4,141 daily losses, p Wilcoxon from a signed-rank test on the eight per-fold averages, and p permutation from flipping signs in blocks of 21 days. A star marks p below 0.05. 'Folds won' says in how many of the eight folds the model came out ahead. Source: phase4-aimdg-vs-gbm/significance.csv.</w:t>
       </w:r>
     </w:p>
     <w:p>
@@ -12869,7 +12869,7 @@
         <w:rPr>
           <w:b/>
         </w:rPr>
-        <w:t>T10. Equal-weight ensembles and their members: volatility</w:t>
+        <w:t>T10. Volatility: two simple averages of models next to the models they average</w:t>
       </w:r>
     </w:p>
     <w:tbl>
@@ -12910,7 +12910,7 @@
               <w:rPr>
                 <w:b/>
               </w:rPr>
-              <w:t>QLIKE 1d</w:t>
+              <w:t>QLIKE (1-day)</w:t>
             </w:r>
           </w:p>
         </w:tc>
@@ -12923,7 +12923,7 @@
               <w:rPr>
                 <w:b/>
               </w:rPr>
-              <w:t>QLIKE 5d</w:t>
+              <w:t>QLIKE (5-day)</w:t>
             </w:r>
           </w:p>
         </w:tc>
@@ -12936,7 +12936,7 @@
               <w:rPr>
                 <w:b/>
               </w:rPr>
-              <w:t>RMSE 1d</w:t>
+              <w:t>RMSE (1-day)</w:t>
             </w:r>
           </w:p>
         </w:tc>
@@ -12949,7 +12949,7 @@
               <w:rPr>
                 <w:b/>
               </w:rPr>
-              <w:t>RMSE 5d</w:t>
+              <w:t>RMSE (5-day)</w:t>
             </w:r>
           </w:p>
         </w:tc>
@@ -12962,7 +12962,7 @@
               <w:rPr>
                 <w:b/>
               </w:rPr>
-              <w:t>MZ R² 1d</w:t>
+              <w:t>MZ R² (1-day)</w:t>
             </w:r>
           </w:p>
         </w:tc>
@@ -12975,7 +12975,7 @@
               <w:rPr>
                 <w:b/>
               </w:rPr>
-              <w:t>MZ R² 5d</w:t>
+              <w:t>MZ R² (5-day)</w:t>
             </w:r>
           </w:p>
         </w:tc>
@@ -13542,7 +13542,7 @@
           <w:i/>
           <w:sz w:val="16"/>
         </w:rPr>
-        <w:t>Test period 4 Jan 2010 – 23 Jun 2026, 4,141 days, 8 folds, monthly refits. Members were chosen on development scores. Best value per column in bold. Source: ensemble-6.2/scoreboard.csv.</w:t>
+        <w:t>Scored over the 4,141 trading days from 4 Jan 2010 to 23 Jun 2026 (eight folds, refitted monthly). Which models to average was decided on development scores. Bold marks the leader of each column. Source: ensemble-6.2/scoreboard.csv.</w:t>
       </w:r>
     </w:p>
     <w:p>
@@ -13553,7 +13553,7 @@
         <w:rPr>
           <w:b/>
         </w:rPr>
-        <w:t>T11. Equal-weight ensembles and their members: 1-day direction</w:t>
+        <w:t>T11. Next-day direction: the two averages next to their members</w:t>
       </w:r>
     </w:p>
     <w:tbl>
@@ -13596,7 +13596,7 @@
               <w:rPr>
                 <w:b/>
               </w:rPr>
-              <w:t>Brier</w:t>
+              <w:t>Brier score</w:t>
             </w:r>
           </w:p>
         </w:tc>
@@ -13609,7 +13609,7 @@
               <w:rPr>
                 <w:b/>
               </w:rPr>
-              <w:t>Log-loss</w:t>
+              <w:t>Log loss</w:t>
             </w:r>
           </w:p>
         </w:tc>
@@ -13635,7 +13635,7 @@
               <w:rPr>
                 <w:b/>
               </w:rPr>
-              <w:t>Hit rate</w:t>
+              <w:t>Accuracy</w:t>
             </w:r>
           </w:p>
         </w:tc>
@@ -13648,7 +13648,7 @@
               <w:rPr>
                 <w:b/>
               </w:rPr>
-              <w:t>Balanced</w:t>
+              <w:t>Balanced accuracy</w:t>
             </w:r>
           </w:p>
         </w:tc>
@@ -13661,7 +13661,7 @@
               <w:rPr>
                 <w:b/>
               </w:rPr>
-              <w:t>Up calls</w:t>
+              <w:t>Share called up</w:t>
             </w:r>
           </w:p>
         </w:tc>
@@ -13674,7 +13674,7 @@
               <w:rPr>
                 <w:b/>
               </w:rPr>
-              <w:t>Up right</w:t>
+              <w:t>Up calls correct</w:t>
             </w:r>
           </w:p>
         </w:tc>
@@ -13687,7 +13687,7 @@
               <w:rPr>
                 <w:b/>
               </w:rPr>
-              <w:t>Down right</w:t>
+              <w:t>Down calls correct</w:t>
             </w:r>
           </w:p>
         </w:tc>
@@ -14414,7 +14414,7 @@
           <w:i/>
           <w:sz w:val="16"/>
         </w:rPr>
-        <w:t>Best value per column in bold. Source: ensemble-6.2/scoreboard.csv.</w:t>
+        <w:t>Bold marks the leader of each column. Source: ensemble-6.2/scoreboard.csv.</w:t>
       </w:r>
     </w:p>
     <w:p>
@@ -14425,7 +14425,7 @@
         <w:rPr>
           <w:b/>
         </w:rPr>
-        <w:t>T12. QLIKE: ensembles and members against gradient boosting</w:t>
+        <w:t>T12. The averages and their members compared with gradient boosting on QLIKE</w:t>
       </w:r>
     </w:p>
     <w:tbl>
@@ -14470,7 +14470,7 @@
               <w:rPr>
                 <w:b/>
               </w:rPr>
-              <w:t>Diff 1d</w:t>
+              <w:t>Mean diff. (1-day)</w:t>
             </w:r>
           </w:p>
         </w:tc>
@@ -14483,7 +14483,7 @@
               <w:rPr>
                 <w:b/>
               </w:rPr>
-              <w:t>DM p 1d</w:t>
+              <w:t>p DM (1-day)</w:t>
             </w:r>
           </w:p>
         </w:tc>
@@ -14496,7 +14496,7 @@
               <w:rPr>
                 <w:b/>
               </w:rPr>
-              <w:t>Wilcoxon p 1d</w:t>
+              <w:t>p Wilcoxon (1-day)</w:t>
             </w:r>
           </w:p>
         </w:tc>
@@ -14509,7 +14509,7 @@
               <w:rPr>
                 <w:b/>
               </w:rPr>
-              <w:t>Perm. p 1d</w:t>
+              <w:t>p permutation (1-day)</w:t>
             </w:r>
           </w:p>
         </w:tc>
@@ -14522,7 +14522,7 @@
               <w:rPr>
                 <w:b/>
               </w:rPr>
-              <w:t>Folds 1d</w:t>
+              <w:t>Folds won (1-day)</w:t>
             </w:r>
           </w:p>
         </w:tc>
@@ -14535,7 +14535,7 @@
               <w:rPr>
                 <w:b/>
               </w:rPr>
-              <w:t>Diff 5d</w:t>
+              <w:t>Mean diff. (5-day)</w:t>
             </w:r>
           </w:p>
         </w:tc>
@@ -14548,7 +14548,7 @@
               <w:rPr>
                 <w:b/>
               </w:rPr>
-              <w:t>DM p 5d</w:t>
+              <w:t>p DM (5-day)</w:t>
             </w:r>
           </w:p>
         </w:tc>
@@ -14561,7 +14561,7 @@
               <w:rPr>
                 <w:b/>
               </w:rPr>
-              <w:t>Wilcoxon p 5d</w:t>
+              <w:t>p Wilcoxon (5-day)</w:t>
             </w:r>
           </w:p>
         </w:tc>
@@ -14574,7 +14574,7 @@
               <w:rPr>
                 <w:b/>
               </w:rPr>
-              <w:t>Perm. p 5d</w:t>
+              <w:t>p permutation (5-day)</w:t>
             </w:r>
           </w:p>
         </w:tc>
@@ -14587,7 +14587,7 @@
               <w:rPr>
                 <w:b/>
               </w:rPr>
-              <w:t>Folds 5d</w:t>
+              <w:t>Folds won (5-day)</w:t>
             </w:r>
           </w:p>
         </w:tc>
@@ -15299,7 +15299,7 @@
           <w:i/>
           <w:sz w:val="16"/>
         </w:rPr>
-        <w:t>Difference: mean loss of the model minus the reference's; negative means the model is better. DM: Diebold–Mariano on the 4,141 daily losses; Wilcoxon: signed-rank over the 8 fold means; Perm.: block permutation (21-day blocks). * p &lt; 0.05. Folds: folds in which the model beat the reference. Source: ensemble-6.2/significance.csv.</w:t>
+        <w:t>A negative mean difference says the model's average loss was lower than the reference's. p DM comes from the Diebold–Mariano test on all 4,141 daily losses, p Wilcoxon from a signed-rank test on the eight per-fold averages, and p permutation from flipping signs in blocks of 21 days. A star marks p below 0.05. 'Folds won' says in how many of the eight folds the model came out ahead. Source: ensemble-6.2/significance.csv.</w:t>
       </w:r>
     </w:p>
     <w:p>
@@ -15310,7 +15310,7 @@
         <w:rPr>
           <w:b/>
         </w:rPr>
-        <w:t>T13. Ablations on the test folds: volatility</w:t>
+        <w:t>T13. Volatility of AIM-DG with one mechanism removed, on the test folds</w:t>
       </w:r>
     </w:p>
     <w:tbl>
@@ -15351,7 +15351,7 @@
               <w:rPr>
                 <w:b/>
               </w:rPr>
-              <w:t>QLIKE 1d</w:t>
+              <w:t>QLIKE (1-day)</w:t>
             </w:r>
           </w:p>
         </w:tc>
@@ -15364,7 +15364,7 @@
               <w:rPr>
                 <w:b/>
               </w:rPr>
-              <w:t>QLIKE 5d</w:t>
+              <w:t>QLIKE (5-day)</w:t>
             </w:r>
           </w:p>
         </w:tc>
@@ -15377,7 +15377,7 @@
               <w:rPr>
                 <w:b/>
               </w:rPr>
-              <w:t>RMSE 1d</w:t>
+              <w:t>RMSE (1-day)</w:t>
             </w:r>
           </w:p>
         </w:tc>
@@ -15390,7 +15390,7 @@
               <w:rPr>
                 <w:b/>
               </w:rPr>
-              <w:t>RMSE 5d</w:t>
+              <w:t>RMSE (5-day)</w:t>
             </w:r>
           </w:p>
         </w:tc>
@@ -15403,7 +15403,7 @@
               <w:rPr>
                 <w:b/>
               </w:rPr>
-              <w:t>MZ R² 1d</w:t>
+              <w:t>MZ R² (1-day)</w:t>
             </w:r>
           </w:p>
         </w:tc>
@@ -15416,7 +15416,7 @@
               <w:rPr>
                 <w:b/>
               </w:rPr>
-              <w:t>MZ R² 5d</w:t>
+              <w:t>MZ R² (5-day)</w:t>
             </w:r>
           </w:p>
         </w:tc>
@@ -15983,7 +15983,7 @@
           <w:i/>
           <w:sz w:val="16"/>
         </w:rPr>
-        <w:t>aimdg_replay: the official run reproduced from cached networks. A1: no evolution (top 3 edges by reliability). A2: no variance penalty in the reliability. Both variants were declared before the replays. Best value per column in bold. Source: phase5-test-ablations/scoreboard.csv.</w:t>
+        <w:t>aimdg_replay rebuilds the official AIM-DG run from the stored networks. In aimdg_A1 the evolutionary search is replaced by the three most reliable edges; in aimdg_A2 the reliability score ignores how much an edge's usefulness varies. Both variants were fixed before they were replayed. Bold marks the leader of each column. Source: phase5-test-ablations/scoreboard.csv.</w:t>
       </w:r>
     </w:p>
     <w:p>
@@ -15994,7 +15994,7 @@
         <w:rPr>
           <w:b/>
         </w:rPr>
-        <w:t>T14. QLIKE: ablations against AIM-DG</w:t>
+        <w:t>T14. The variants compared with AIM-DG itself on QLIKE</w:t>
       </w:r>
     </w:p>
     <w:tbl>
@@ -16039,7 +16039,7 @@
               <w:rPr>
                 <w:b/>
               </w:rPr>
-              <w:t>Diff 1d</w:t>
+              <w:t>Mean diff. (1-day)</w:t>
             </w:r>
           </w:p>
         </w:tc>
@@ -16052,7 +16052,7 @@
               <w:rPr>
                 <w:b/>
               </w:rPr>
-              <w:t>DM p 1d</w:t>
+              <w:t>p DM (1-day)</w:t>
             </w:r>
           </w:p>
         </w:tc>
@@ -16065,7 +16065,7 @@
               <w:rPr>
                 <w:b/>
               </w:rPr>
-              <w:t>Wilcoxon p 1d</w:t>
+              <w:t>p Wilcoxon (1-day)</w:t>
             </w:r>
           </w:p>
         </w:tc>
@@ -16078,7 +16078,7 @@
               <w:rPr>
                 <w:b/>
               </w:rPr>
-              <w:t>Perm. p 1d</w:t>
+              <w:t>p permutation (1-day)</w:t>
             </w:r>
           </w:p>
         </w:tc>
@@ -16091,7 +16091,7 @@
               <w:rPr>
                 <w:b/>
               </w:rPr>
-              <w:t>Folds 1d</w:t>
+              <w:t>Folds won (1-day)</w:t>
             </w:r>
           </w:p>
         </w:tc>
@@ -16104,7 +16104,7 @@
               <w:rPr>
                 <w:b/>
               </w:rPr>
-              <w:t>Diff 5d</w:t>
+              <w:t>Mean diff. (5-day)</w:t>
             </w:r>
           </w:p>
         </w:tc>
@@ -16117,7 +16117,7 @@
               <w:rPr>
                 <w:b/>
               </w:rPr>
-              <w:t>DM p 5d</w:t>
+              <w:t>p DM (5-day)</w:t>
             </w:r>
           </w:p>
         </w:tc>
@@ -16130,7 +16130,7 @@
               <w:rPr>
                 <w:b/>
               </w:rPr>
-              <w:t>Wilcoxon p 5d</w:t>
+              <w:t>p Wilcoxon (5-day)</w:t>
             </w:r>
           </w:p>
         </w:tc>
@@ -16143,7 +16143,7 @@
               <w:rPr>
                 <w:b/>
               </w:rPr>
-              <w:t>Perm. p 5d</w:t>
+              <w:t>p permutation (5-day)</w:t>
             </w:r>
           </w:p>
         </w:tc>
@@ -16156,7 +16156,7 @@
               <w:rPr>
                 <w:b/>
               </w:rPr>
-              <w:t>Folds 5d</w:t>
+              <w:t>Folds won (5-day)</w:t>
             </w:r>
           </w:p>
         </w:tc>
@@ -16868,7 +16868,7 @@
           <w:i/>
           <w:sz w:val="16"/>
         </w:rPr>
-        <w:t>Difference: mean loss of the model minus the reference's; negative means the model is better. DM: Diebold–Mariano on the 4,141 daily losses; Wilcoxon: signed-rank over the 8 fold means; Perm.: block permutation (21-day blocks). * p &lt; 0.05. Folds: folds in which the model beat the reference. Read A2 with care: its final selection differs from AIM-DG's in 3 of the 200 months and its forecasts on 266 of the 4,141 days, so its p-values rest on few months. Source: phase5-test-ablations-vs-aimdg/significance.csv.</w:t>
+        <w:t>A negative mean difference says the model's average loss was lower than the reference's. p DM comes from the Diebold–Mariano test on all 4,141 daily losses, p Wilcoxon from a signed-rank test on the eight per-fold averages, and p permutation from flipping signs in blocks of 21 days. A star marks p below 0.05. 'Folds won' says in how many of the eight folds the model came out ahead. Caution for aimdg_A2: it picked different edges from AIM-DG in only 3 of the 200 months (266 of 4,141 forecast days differ), so its p-values depend on very few months. Source: phase5-test-ablations-vs-aimdg/significance.csv.</w:t>
       </w:r>
     </w:p>
     <w:p>
@@ -16879,7 +16879,7 @@
         <w:rPr>
           <w:b/>
         </w:rPr>
-        <w:t>T15. QLIKE: AIM-DG and its ablations against the static graph</w:t>
+        <w:t>T15. AIM-DG and its variants compared with the static graph on QLIKE</w:t>
       </w:r>
     </w:p>
     <w:tbl>
@@ -16924,7 +16924,7 @@
               <w:rPr>
                 <w:b/>
               </w:rPr>
-              <w:t>Diff 1d</w:t>
+              <w:t>Mean diff. (1-day)</w:t>
             </w:r>
           </w:p>
         </w:tc>
@@ -16937,7 +16937,7 @@
               <w:rPr>
                 <w:b/>
               </w:rPr>
-              <w:t>DM p 1d</w:t>
+              <w:t>p DM (1-day)</w:t>
             </w:r>
           </w:p>
         </w:tc>
@@ -16950,7 +16950,7 @@
               <w:rPr>
                 <w:b/>
               </w:rPr>
-              <w:t>Wilcoxon p 1d</w:t>
+              <w:t>p Wilcoxon (1-day)</w:t>
             </w:r>
           </w:p>
         </w:tc>
@@ -16963,7 +16963,7 @@
               <w:rPr>
                 <w:b/>
               </w:rPr>
-              <w:t>Perm. p 1d</w:t>
+              <w:t>p permutation (1-day)</w:t>
             </w:r>
           </w:p>
         </w:tc>
@@ -16976,7 +16976,7 @@
               <w:rPr>
                 <w:b/>
               </w:rPr>
-              <w:t>Folds 1d</w:t>
+              <w:t>Folds won (1-day)</w:t>
             </w:r>
           </w:p>
         </w:tc>
@@ -16989,7 +16989,7 @@
               <w:rPr>
                 <w:b/>
               </w:rPr>
-              <w:t>Diff 5d</w:t>
+              <w:t>Mean diff. (5-day)</w:t>
             </w:r>
           </w:p>
         </w:tc>
@@ -17002,7 +17002,7 @@
               <w:rPr>
                 <w:b/>
               </w:rPr>
-              <w:t>DM p 5d</w:t>
+              <w:t>p DM (5-day)</w:t>
             </w:r>
           </w:p>
         </w:tc>
@@ -17015,7 +17015,7 @@
               <w:rPr>
                 <w:b/>
               </w:rPr>
-              <w:t>Wilcoxon p 5d</w:t>
+              <w:t>p Wilcoxon (5-day)</w:t>
             </w:r>
           </w:p>
         </w:tc>
@@ -17028,7 +17028,7 @@
               <w:rPr>
                 <w:b/>
               </w:rPr>
-              <w:t>Perm. p 5d</w:t>
+              <w:t>p permutation (5-day)</w:t>
             </w:r>
           </w:p>
         </w:tc>
@@ -17041,7 +17041,7 @@
               <w:rPr>
                 <w:b/>
               </w:rPr>
-              <w:t>Folds 5d</w:t>
+              <w:t>Folds won (5-day)</w:t>
             </w:r>
           </w:p>
         </w:tc>
@@ -17753,7 +17753,7 @@
           <w:i/>
           <w:sz w:val="16"/>
         </w:rPr>
-        <w:t>Difference: mean loss of the model minus the reference's; negative means the model is better. DM: Diebold–Mariano on the 4,141 daily losses; Wilcoxon: signed-rank over the 8 fold means; Perm.: block permutation (21-day blocks). * p &lt; 0.05. Folds: folds in which the model beat the reference. Source: phase5-test-ablations/significance.csv.</w:t>
+        <w:t>A negative mean difference says the model's average loss was lower than the reference's. p DM comes from the Diebold–Mariano test on all 4,141 daily losses, p Wilcoxon from a signed-rank test on the eight per-fold averages, and p permutation from flipping signs in blocks of 21 days. A star marks p below 0.05. 'Folds won' says in how many of the eight folds the model came out ahead. Source: phase5-test-ablations/significance.csv.</w:t>
       </w:r>
     </w:p>
     <w:p>
@@ -17764,7 +17764,7 @@
         <w:rPr>
           <w:b/>
         </w:rPr>
-        <w:t>T16. Hit rate on the most confident days, 1-day horizon</w:t>
+        <w:t>T16. Accuracy when a model calls only its most confident days (1 day ahead)</w:t>
       </w:r>
     </w:p>
     <w:tbl>
@@ -18723,7 +18723,7 @@
           <w:i/>
           <w:sz w:val="16"/>
         </w:rPr>
-        <w:t>Confident days: the forecast's distance from 50% is strictly above the matching quantile of the model's previous 252 forecasts (causal gate, D-31). Because forecast confidence drifts over time, a gate set on the past selects more days than its target: the 10% target selected 11.3–17.8% of days for the learned models, 20% 20.6–28.6%, 30% 30.1–36.9%, 50% 46.8–53.9%. Cells: hit rate (edge over always-up on the same days, in points); * one-sided block permutation p &lt; 0.05 for a positive edge. Climatology and EWMA always call up. Source: phase4-aimdg/selective.csv.</w:t>
+        <w:t>A day counts as confident when the forecast sits further from 50% than the chosen quantile of the 252 forecasts the model made before it (D-31; ties do not count). Confidence tends to rise over the years, so a threshold taken from the past lets through more days than the target. For the fitted models the share of days actually used was 11.3–17.8% for the 10% target, 20.6–28.6% for 20%, 30.1–36.9% for 30% and 46.8–53.9% for 50%. Each cell gives the accuracy and, in brackets, its margin in points over always calling a rise on the same days; a star means a one-sided block-permutation p below 0.05. Climatology and EWMA only ever call a rise. Source: phase4-aimdg/selective.csv.</w:t>
       </w:r>
     </w:p>
     <w:p>
@@ -18734,7 +18734,7 @@
         <w:rPr>
           <w:b/>
         </w:rPr>
-        <w:t>T17. Hit rate on the most confident days, 5-day horizon</w:t>
+        <w:t>T17. Accuracy when a model calls only its most confident days (5 days ahead)</w:t>
       </w:r>
     </w:p>
     <w:tbl>
@@ -19693,7 +19693,7 @@
           <w:i/>
           <w:sz w:val="16"/>
         </w:rPr>
-        <w:t>Confident days: the forecast's distance from 50% is strictly above the matching quantile of the model's previous 252 forecasts (causal gate, D-31). Because forecast confidence drifts over time, a gate set on the past selects more days than its target: the 10% target selected 11.5–18.7% of days for the learned models, 20% 21.4–26.8%, 30% 29.4–34.9%, 50% 45.3–52.6%. Cells: hit rate (edge over always-up on the same days, in points); * one-sided block permutation p &lt; 0.05 for a positive edge. Climatology and EWMA always call up. Source: phase4-aimdg/selective.csv.</w:t>
+        <w:t>A day counts as confident when the forecast sits further from 50% than the chosen quantile of the 252 forecasts the model made before it (D-31; ties do not count). Confidence tends to rise over the years, so a threshold taken from the past lets through more days than the target. For the fitted models the share of days actually used was 11.5–18.7% for the 10% target, 21.4–26.8% for 20%, 29.4–34.9% for 30% and 45.3–52.6% for 50%. Each cell gives the accuracy and, in brackets, its margin in points over always calling a rise on the same days; a star means a one-sided block-permutation p below 0.05. Climatology and EWMA only ever call a rise. Source: phase4-aimdg/selective.csv.</w:t>
       </w:r>
     </w:p>
     <w:p>
@@ -19704,7 +19704,7 @@
         <w:rPr>
           <w:b/>
         </w:rPr>
-        <w:t>T18. Two-sided scorecard at the 10% coverage target</w:t>
+        <w:t>T18. Buy calls and sell calls judged separately, 10% coverage target</w:t>
       </w:r>
     </w:p>
     <w:tbl>
@@ -19747,7 +19747,7 @@
               <w:rPr>
                 <w:b/>
               </w:rPr>
-              <w:t>Horizon</w:t>
+              <w:t>Days ahead</w:t>
             </w:r>
           </w:p>
         </w:tc>
@@ -19760,7 +19760,7 @@
               <w:rPr>
                 <w:b/>
               </w:rPr>
-              <w:t>Days selected</w:t>
+              <w:t>Share of days</w:t>
             </w:r>
           </w:p>
         </w:tc>
@@ -19773,7 +19773,7 @@
               <w:rPr>
                 <w:b/>
               </w:rPr>
-              <w:t>Up calls</w:t>
+              <w:t>Buy calls</w:t>
             </w:r>
           </w:p>
         </w:tc>
@@ -19786,7 +19786,7 @@
               <w:rPr>
                 <w:b/>
               </w:rPr>
-              <w:t>Up right</w:t>
+              <w:t>Buy calls correct</w:t>
             </w:r>
           </w:p>
         </w:tc>
@@ -19799,7 +19799,7 @@
               <w:rPr>
                 <w:b/>
               </w:rPr>
-              <w:t>Up p</w:t>
+              <w:t>p (buy)</w:t>
             </w:r>
           </w:p>
         </w:tc>
@@ -19812,7 +19812,7 @@
               <w:rPr>
                 <w:b/>
               </w:rPr>
-              <w:t>Down calls</w:t>
+              <w:t>Sell calls</w:t>
             </w:r>
           </w:p>
         </w:tc>
@@ -19825,7 +19825,7 @@
               <w:rPr>
                 <w:b/>
               </w:rPr>
-              <w:t>Down right</w:t>
+              <w:t>Sell calls correct</w:t>
             </w:r>
           </w:p>
         </w:tc>
@@ -19838,7 +19838,7 @@
               <w:rPr>
                 <w:b/>
               </w:rPr>
-              <w:t>Down p</w:t>
+              <w:t>p (sell)</w:t>
             </w:r>
           </w:p>
         </w:tc>
@@ -19869,7 +19869,7 @@
               <w:rPr>
                 <w:b w:val="0"/>
               </w:rPr>
-              <w:t>1d</w:t>
+              <w:t>1</w:t>
             </w:r>
           </w:p>
         </w:tc>
@@ -20012,7 +20012,7 @@
               <w:rPr>
                 <w:b w:val="0"/>
               </w:rPr>
-              <w:t>1d</w:t>
+              <w:t>1</w:t>
             </w:r>
           </w:p>
         </w:tc>
@@ -20155,7 +20155,7 @@
               <w:rPr>
                 <w:b w:val="0"/>
               </w:rPr>
-              <w:t>1d</w:t>
+              <w:t>1</w:t>
             </w:r>
           </w:p>
         </w:tc>
@@ -20298,7 +20298,7 @@
               <w:rPr>
                 <w:b w:val="0"/>
               </w:rPr>
-              <w:t>1d</w:t>
+              <w:t>1</w:t>
             </w:r>
           </w:p>
         </w:tc>
@@ -20441,7 +20441,7 @@
               <w:rPr>
                 <w:b w:val="0"/>
               </w:rPr>
-              <w:t>1d</w:t>
+              <w:t>1</w:t>
             </w:r>
           </w:p>
         </w:tc>
@@ -20584,7 +20584,7 @@
               <w:rPr>
                 <w:b w:val="0"/>
               </w:rPr>
-              <w:t>1d</w:t>
+              <w:t>1</w:t>
             </w:r>
           </w:p>
         </w:tc>
@@ -20727,7 +20727,7 @@
               <w:rPr>
                 <w:b w:val="0"/>
               </w:rPr>
-              <w:t>1d</w:t>
+              <w:t>1</w:t>
             </w:r>
           </w:p>
         </w:tc>
@@ -20870,7 +20870,7 @@
               <w:rPr>
                 <w:b w:val="0"/>
               </w:rPr>
-              <w:t>1d</w:t>
+              <w:t>1</w:t>
             </w:r>
           </w:p>
         </w:tc>
@@ -21013,7 +21013,7 @@
               <w:rPr>
                 <w:b w:val="0"/>
               </w:rPr>
-              <w:t>1d</w:t>
+              <w:t>1</w:t>
             </w:r>
           </w:p>
         </w:tc>
@@ -21156,7 +21156,7 @@
               <w:rPr>
                 <w:b w:val="0"/>
               </w:rPr>
-              <w:t>5d</w:t>
+              <w:t>5</w:t>
             </w:r>
           </w:p>
         </w:tc>
@@ -21299,7 +21299,7 @@
               <w:rPr>
                 <w:b w:val="0"/>
               </w:rPr>
-              <w:t>5d</w:t>
+              <w:t>5</w:t>
             </w:r>
           </w:p>
         </w:tc>
@@ -21442,7 +21442,7 @@
               <w:rPr>
                 <w:b w:val="0"/>
               </w:rPr>
-              <w:t>5d</w:t>
+              <w:t>5</w:t>
             </w:r>
           </w:p>
         </w:tc>
@@ -21585,7 +21585,7 @@
               <w:rPr>
                 <w:b w:val="0"/>
               </w:rPr>
-              <w:t>5d</w:t>
+              <w:t>5</w:t>
             </w:r>
           </w:p>
         </w:tc>
@@ -21728,7 +21728,7 @@
               <w:rPr>
                 <w:b w:val="0"/>
               </w:rPr>
-              <w:t>5d</w:t>
+              <w:t>5</w:t>
             </w:r>
           </w:p>
         </w:tc>
@@ -21871,7 +21871,7 @@
               <w:rPr>
                 <w:b w:val="0"/>
               </w:rPr>
-              <w:t>5d</w:t>
+              <w:t>5</w:t>
             </w:r>
           </w:p>
         </w:tc>
@@ -22014,7 +22014,7 @@
               <w:rPr>
                 <w:b w:val="0"/>
               </w:rPr>
-              <w:t>5d</w:t>
+              <w:t>5</w:t>
             </w:r>
           </w:p>
         </w:tc>
@@ -22157,7 +22157,7 @@
               <w:rPr>
                 <w:b w:val="0"/>
               </w:rPr>
-              <w:t>5d</w:t>
+              <w:t>5</w:t>
             </w:r>
           </w:p>
         </w:tc>
@@ -22300,7 +22300,7 @@
               <w:rPr>
                 <w:b w:val="0"/>
               </w:rPr>
-              <w:t>5d</w:t>
+              <w:t>5</w:t>
             </w:r>
           </w:p>
         </w:tc>
@@ -22424,7 +22424,7 @@
           <w:i/>
           <w:sz w:val="16"/>
         </w:rPr>
-        <w:t>Confident days: the forecast's distance from 50% is strictly above the matching quantile of the model's previous 252 forecasts (causal gate, D-31). Because forecast confidence drifts over time, a gate set on the past selects more days than its target (Days selected). p: one-sided binomial test of the share right against the stricter of 50% and that side's base rate on the selected days, with n/h effective trials. * p &lt; 0.05. Source: phase4-aimdg/selective.csv.</w:t>
+        <w:t>A day counts as confident when the forecast sits further from 50% than the chosen quantile of the 252 forecasts the model made before it (D-31; ties do not count). Confidence tends to rise over the years, so a threshold taken from the past lets through more days than the target ('Share of days'). Each p-value is a one-sided binomial test of whether that kind of call was right more often than both 50% and the share of selected days that actually moved that way, counting n/h independent trials. A star marks p below 0.05. Source: phase4-aimdg/selective.csv.</w:t>
       </w:r>
     </w:p>
     <w:p>
@@ -22435,7 +22435,7 @@
         <w:rPr>
           <w:b/>
         </w:rPr>
-        <w:t>T19. Signal and risk layer, 1-day trades at the 10% coverage target</w:t>
+        <w:t>T19. Trading the forecasts with a stop and a target: 1-day holding, confident days only (10% target)</w:t>
       </w:r>
     </w:p>
     <w:tbl>
@@ -22504,7 +22504,7 @@
               <w:rPr>
                 <w:b/>
               </w:rPr>
-              <w:t>Win rate</w:t>
+              <w:t>Winning trades</w:t>
             </w:r>
           </w:p>
         </w:tc>
@@ -22517,7 +22517,7 @@
               <w:rPr>
                 <w:b/>
               </w:rPr>
-              <w:t>Profit factor</w:t>
+              <w:t>Gain/loss ratio</w:t>
             </w:r>
           </w:p>
         </w:tc>
@@ -22530,7 +22530,7 @@
               <w:rPr>
                 <w:b/>
               </w:rPr>
-              <w:t>Mean net (bps)</w:t>
+              <w:t>Net per trade (bps)</w:t>
             </w:r>
           </w:p>
         </w:tc>
@@ -22543,7 +22543,7 @@
               <w:rPr>
                 <w:b/>
               </w:rPr>
-              <w:t>p (mean &gt; 0)</w:t>
+              <w:t>p (net &gt; 0)</w:t>
             </w:r>
           </w:p>
         </w:tc>
@@ -22556,7 +22556,7 @@
               <w:rPr>
                 <w:b/>
               </w:rPr>
-              <w:t>Total return</w:t>
+              <w:t>Account return</w:t>
             </w:r>
           </w:p>
         </w:tc>
@@ -22569,7 +22569,7 @@
               <w:rPr>
                 <w:b/>
               </w:rPr>
-              <w:t>Max drawdown</w:t>
+              <w:t>Worst drawdown</w:t>
             </w:r>
           </w:p>
         </w:tc>
@@ -25584,7 +25584,7 @@
           <w:i/>
           <w:sz w:val="16"/>
         </w:rPr>
-        <w:t>Rules fixed beforehand: entry at the close on confident days, stop 1σ, target 1.5σ of the forecast move, a day hitting both counts as the stop, 10 bps round trip, 1% risk per trade, one position at a time. p: one-sided test that the mean net return is positive. * p &lt; 0.05. Signals: the causal gate of D-31, strictly above the threshold; the 10% target gave signals on 14.7–18.0% of the 4,141 test days (Trades, side 'both'). Source: signals-6.2/signals.csv, signals-ensemble/signals.csv.</w:t>
+        <w:t>Trades open at the close of a confident day, exit at a stop one forecast standard deviation away or a target one and a half away, and a day that touches both is booked as a stop. Each trade costs 10 basis points in total and risks 1% of the account, with at most one position open. These rules were set before any result. The p-value tests, one-sided, whether the average net result per trade is above zero; a star marks p below 0.05. Signals come from the confidence gate of D-31; with the 10% target they fell on 14.7–18.0% of the 4,141 test days (Trades column, side 'both'). Source: signals-6.2/signals.csv, signals-ensemble/signals.csv.</w:t>
       </w:r>
     </w:p>
     <w:p>
@@ -25595,7 +25595,7 @@
         <w:rPr>
           <w:b/>
         </w:rPr>
-        <w:t>T20. Signal and risk layer, 5-day trades at the 10% coverage target</w:t>
+        <w:t>T20. Trading the forecasts with a stop and a target: 5-day holding, confident days only (10% target)</w:t>
       </w:r>
     </w:p>
     <w:tbl>
@@ -25664,7 +25664,7 @@
               <w:rPr>
                 <w:b/>
               </w:rPr>
-              <w:t>Win rate</w:t>
+              <w:t>Winning trades</w:t>
             </w:r>
           </w:p>
         </w:tc>
@@ -25677,7 +25677,7 @@
               <w:rPr>
                 <w:b/>
               </w:rPr>
-              <w:t>Profit factor</w:t>
+              <w:t>Gain/loss ratio</w:t>
             </w:r>
           </w:p>
         </w:tc>
@@ -25690,7 +25690,7 @@
               <w:rPr>
                 <w:b/>
               </w:rPr>
-              <w:t>Mean net (bps)</w:t>
+              <w:t>Net per trade (bps)</w:t>
             </w:r>
           </w:p>
         </w:tc>
@@ -25703,7 +25703,7 @@
               <w:rPr>
                 <w:b/>
               </w:rPr>
-              <w:t>p (mean &gt; 0)</w:t>
+              <w:t>p (net &gt; 0)</w:t>
             </w:r>
           </w:p>
         </w:tc>
@@ -25716,7 +25716,7 @@
               <w:rPr>
                 <w:b/>
               </w:rPr>
-              <w:t>Total return</w:t>
+              <w:t>Account return</w:t>
             </w:r>
           </w:p>
         </w:tc>
@@ -25729,7 +25729,7 @@
               <w:rPr>
                 <w:b/>
               </w:rPr>
-              <w:t>Max drawdown</w:t>
+              <w:t>Worst drawdown</w:t>
             </w:r>
           </w:p>
         </w:tc>
@@ -28744,7 +28744,7 @@
           <w:i/>
           <w:sz w:val="16"/>
         </w:rPr>
-        <w:t>Rules fixed beforehand: entry at the close on confident days, stop 1σ, target 1.5σ of the forecast move, a day hitting both counts as the stop, 10 bps round trip, 1% risk per trade, one position at a time. p: one-sided test that the mean net return is positive. * p &lt; 0.05. Signals: the causal gate of D-31, strictly above the threshold; the 10% target gave signals on 12.4–18.7% of the 4,141 test days (Trades, side 'both'). Source: signals-6.2/signals.csv, signals-ensemble/signals.csv.</w:t>
+        <w:t>Trades open at the close of a confident day, exit at a stop one forecast standard deviation away or a target one and a half away, and a day that touches both is booked as a stop. Each trade costs 10 basis points in total and risks 1% of the account, with at most one position open. These rules were set before any result. The p-value tests, one-sided, whether the average net result per trade is above zero; a star marks p below 0.05. Signals come from the confidence gate of D-31; with the 10% target they fell on 12.4–18.7% of the 4,141 test days (Trades column, side 'both'). Source: signals-6.2/signals.csv, signals-ensemble/signals.csv.</w:t>
       </w:r>
     </w:p>
     <w:p>
@@ -28755,7 +28755,7 @@
         <w:rPr>
           <w:b/>
         </w:rPr>
-        <w:t>T21. Signal and risk layer, 1-day trades on every day</w:t>
+        <w:t>T21. Trading the forecasts with a stop and a target: 1-day holding, a trade every day</w:t>
       </w:r>
     </w:p>
     <w:tbl>
@@ -28824,7 +28824,7 @@
               <w:rPr>
                 <w:b/>
               </w:rPr>
-              <w:t>Win rate</w:t>
+              <w:t>Winning trades</w:t>
             </w:r>
           </w:p>
         </w:tc>
@@ -28837,7 +28837,7 @@
               <w:rPr>
                 <w:b/>
               </w:rPr>
-              <w:t>Profit factor</w:t>
+              <w:t>Gain/loss ratio</w:t>
             </w:r>
           </w:p>
         </w:tc>
@@ -28850,7 +28850,7 @@
               <w:rPr>
                 <w:b/>
               </w:rPr>
-              <w:t>Mean net (bps)</w:t>
+              <w:t>Net per trade (bps)</w:t>
             </w:r>
           </w:p>
         </w:tc>
@@ -28863,7 +28863,7 @@
               <w:rPr>
                 <w:b/>
               </w:rPr>
-              <w:t>p (mean &gt; 0)</w:t>
+              <w:t>p (net &gt; 0)</w:t>
             </w:r>
           </w:p>
         </w:tc>
@@ -28876,7 +28876,7 @@
               <w:rPr>
                 <w:b/>
               </w:rPr>
-              <w:t>Total return</w:t>
+              <w:t>Account return</w:t>
             </w:r>
           </w:p>
         </w:tc>
@@ -28889,7 +28889,7 @@
               <w:rPr>
                 <w:b/>
               </w:rPr>
-              <w:t>Max drawdown</w:t>
+              <w:t>Worst drawdown</w:t>
             </w:r>
           </w:p>
         </w:tc>
@@ -31904,7 +31904,7 @@
           <w:i/>
           <w:sz w:val="16"/>
         </w:rPr>
-        <w:t>Rules fixed beforehand: entry at the close on confident days, stop 1σ, target 1.5σ of the forecast move, a day hitting both counts as the stop, 10 bps round trip, 1% risk per trade, one position at a time. p: one-sided test that the mean net return is positive. * p &lt; 0.05. Source: signals-6.2/signals.csv, signals-ensemble/signals.csv.</w:t>
+        <w:t>Trades open at the close of a confident day, exit at a stop one forecast standard deviation away or a target one and a half away, and a day that touches both is booked as a stop. Each trade costs 10 basis points in total and risks 1% of the account, with at most one position open. These rules were set before any result. The p-value tests, one-sided, whether the average net result per trade is above zero; a star marks p below 0.05. Source: signals-6.2/signals.csv, signals-ensemble/signals.csv.</w:t>
       </w:r>
     </w:p>
     <w:p>
@@ -31915,7 +31915,7 @@
         <w:rPr>
           <w:b/>
         </w:rPr>
-        <w:t>T22. Ablations and sensitivity of the selection settings (development data)</w:t>
+        <w:t>T22. How the choice of edges and the score respond to each selection setting</w:t>
       </w:r>
     </w:p>
     <w:tbl>
@@ -31943,7 +31943,7 @@
               <w:rPr>
                 <w:b/>
               </w:rPr>
-              <w:t>Setting</w:t>
+              <w:t>Variant</w:t>
             </w:r>
           </w:p>
         </w:tc>
@@ -31956,7 +31956,7 @@
               <w:rPr>
                 <w:b/>
               </w:rPr>
-              <w:t>Joint loss</w:t>
+              <w:t>Joint score</w:t>
             </w:r>
           </w:p>
         </w:tc>
@@ -31969,7 +31969,7 @@
               <w:rPr>
                 <w:b/>
               </w:rPr>
-              <w:t>Diff. vs default</w:t>
+              <w:t>Change vs default</w:t>
             </w:r>
           </w:p>
         </w:tc>
@@ -31982,7 +31982,7 @@
               <w:rPr>
                 <w:b/>
               </w:rPr>
-              <w:t>Points better</w:t>
+              <w:t>Points improved</w:t>
             </w:r>
           </w:p>
         </w:tc>
@@ -31995,7 +31995,7 @@
               <w:rPr>
                 <w:b/>
               </w:rPr>
-              <w:t>Wilcoxon p</w:t>
+              <w:t>p (Wilcoxon)</w:t>
             </w:r>
           </w:p>
         </w:tc>
@@ -32008,7 +32008,7 @@
               <w:rPr>
                 <w:b/>
               </w:rPr>
-              <w:t>Edges on</w:t>
+              <w:t>Edges active</w:t>
             </w:r>
           </w:p>
         </w:tc>
@@ -32021,7 +32021,7 @@
               <w:rPr>
                 <w:b/>
               </w:rPr>
-              <w:t>Edges moved</w:t>
+              <w:t>Edges differing</w:t>
             </w:r>
           </w:p>
         </w:tc>
@@ -34364,7 +34364,7 @@
           <w:i/>
           <w:sz w:val="16"/>
         </w:rPr>
-        <w:t>Selection lab on cached networks at the 17 yearly tuning points (D-38). Joint loss: logloss1 + logloss5 + ½(QLIKE1 + QLIKE5), out of fold. Edges moved: edges that differ from the default's selection, per point. Development scores, not test performance. * p &lt; 0.05. Source: phase5-lab/lab_summary.csv.</w:t>
+        <w:t>Every variant reuses the same stored networks at the 17 yearly tuning points, so only the edge selection changes (D-38). The joint score adds the two log losses and half of the two QLIKE values, measured out of fold; lower is better. 'Edges differing' counts, per point, the edges that differ from the default choice. These are development scores, not test results; a star marks p below 0.05. Source: phase5-lab/lab_summary.csv.</w:t>
       </w:r>
     </w:p>
     <w:p>
@@ -34375,7 +34375,7 @@
         <w:rPr>
           <w:b/>
         </w:rPr>
-        <w:t>T23. Sensitivity of the sequential settings (development walk-forward)</w:t>
+        <w:t>T23. Month-by-month settings tried over a single development year</w:t>
       </w:r>
     </w:p>
     <w:tbl>
@@ -34405,7 +34405,7 @@
               <w:rPr>
                 <w:b/>
               </w:rPr>
-              <w:t>Setting</w:t>
+              <w:t>Variant</w:t>
             </w:r>
           </w:p>
         </w:tc>
@@ -34418,7 +34418,7 @@
               <w:rPr>
                 <w:b/>
               </w:rPr>
-              <w:t>Cadence (days)</w:t>
+              <w:t>Refit every (days)</w:t>
             </w:r>
           </w:p>
         </w:tc>
@@ -34444,7 +34444,7 @@
               <w:rPr>
                 <w:b/>
               </w:rPr>
-              <w:t>Joint loss</w:t>
+              <w:t>Joint score</w:t>
             </w:r>
           </w:p>
         </w:tc>
@@ -34457,7 +34457,7 @@
               <w:rPr>
                 <w:b/>
               </w:rPr>
-              <w:t>Diff. vs default</w:t>
+              <w:t>Change vs default</w:t>
             </w:r>
           </w:p>
         </w:tc>
@@ -34470,7 +34470,7 @@
               <w:rPr>
                 <w:b/>
               </w:rPr>
-              <w:t>Edges on</w:t>
+              <w:t>Edges active</w:t>
             </w:r>
           </w:p>
         </w:tc>
@@ -34483,7 +34483,7 @@
               <w:rPr>
                 <w:b/>
               </w:rPr>
-              <w:t>Edges changed per refit</w:t>
+              <w:t>Edges switched per refit</w:t>
             </w:r>
           </w:p>
         </w:tc>
@@ -36094,7 +36094,7 @@
           <w:i/>
           <w:sz w:val="16"/>
         </w:rPr>
-        <w:t>One development year replayed with each setting (D-38). Seconds: selection time for the year. Source: phase5-walkforward/walkforward.csv.</w:t>
+        <w:t>Each variant replays the same development year month by month (D-38); 'Seconds' is the selection time for the whole year. With so few refits these numbers are only indicative. Source: phase5-walkforward/walkforward.csv.</w:t>
       </w:r>
     </w:p>
     <w:p>
@@ -36105,7 +36105,7 @@
         <w:rPr>
           <w:b/>
         </w:rPr>
-        <w:t>T24. Edge clusters in stress months against the rest (primary tests)</w:t>
+        <w:t>T24. Do the edge groups behave differently in stress months? The six planned tests</w:t>
       </w:r>
     </w:p>
     <w:tbl>
@@ -36147,7 +36147,7 @@
               <w:rPr>
                 <w:b/>
               </w:rPr>
-              <w:t>Measure</w:t>
+              <w:t>Quantity</w:t>
             </w:r>
           </w:p>
         </w:tc>
@@ -36160,7 +36160,7 @@
               <w:rPr>
                 <w:b/>
               </w:rPr>
-              <w:t>Hypothesis</w:t>
+              <w:t>Expected direction</w:t>
             </w:r>
           </w:p>
         </w:tc>
@@ -36173,7 +36173,7 @@
               <w:rPr>
                 <w:b/>
               </w:rPr>
-              <w:t>Inside</w:t>
+              <w:t>Stress months</w:t>
             </w:r>
           </w:p>
         </w:tc>
@@ -36186,7 +36186,7 @@
               <w:rPr>
                 <w:b/>
               </w:rPr>
-              <w:t>Outside</w:t>
+              <w:t>Other months</w:t>
             </w:r>
           </w:p>
         </w:tc>
@@ -36199,7 +36199,7 @@
               <w:rPr>
                 <w:b/>
               </w:rPr>
-              <w:t>Difference</w:t>
+              <w:t>Gap</w:t>
             </w:r>
           </w:p>
         </w:tc>
@@ -36225,7 +36225,7 @@
               <w:rPr>
                 <w:b/>
               </w:rPr>
-              <w:t>Months inside</w:t>
+              <w:t>Stress months (n)</w:t>
             </w:r>
           </w:p>
         </w:tc>
@@ -36999,7 +36999,7 @@
           <w:i/>
           <w:sz w:val="16"/>
         </w:rPr>
-        <w:t>One-sided circular-shift permutation test; hypotheses and regimes fixed before the results by date were computed (D-40). Inside / outside: mean over months inside and outside the regime. * p &lt; 0.05. Source: edges-6.3/regime_tests.csv.</w:t>
+        <w:t>p-values come from rotating the monthly edge record against the calendar (circular shifts, one-sided). The regimes and the expected directions were written down before any dated result (D-40). The two month columns are averages over stress months and over all other months. A star marks p below 0.05. Source: edges-6.3/regime_tests.csv.</w:t>
       </w:r>
     </w:p>
     <w:p>
@@ -37010,7 +37010,7 @@
         <w:rPr>
           <w:b/>
         </w:rPr>
-        <w:t>T25. Edge clusters per regime (descriptive)</w:t>
+        <w:t>T25. The same comparison for each stress regime on its own</w:t>
       </w:r>
     </w:p>
     <w:tbl>
@@ -37053,7 +37053,7 @@
               <w:rPr>
                 <w:b/>
               </w:rPr>
-              <w:t>Measure</w:t>
+              <w:t>Quantity</w:t>
             </w:r>
           </w:p>
         </w:tc>
@@ -37079,7 +37079,7 @@
               <w:rPr>
                 <w:b/>
               </w:rPr>
-              <w:t>Hypothesis</w:t>
+              <w:t>Expected direction</w:t>
             </w:r>
           </w:p>
         </w:tc>
@@ -37092,7 +37092,7 @@
               <w:rPr>
                 <w:b/>
               </w:rPr>
-              <w:t>Inside</w:t>
+              <w:t>Stress months</w:t>
             </w:r>
           </w:p>
         </w:tc>
@@ -37105,7 +37105,7 @@
               <w:rPr>
                 <w:b/>
               </w:rPr>
-              <w:t>Outside</w:t>
+              <w:t>Other months</w:t>
             </w:r>
           </w:p>
         </w:tc>
@@ -37118,7 +37118,7 @@
               <w:rPr>
                 <w:b/>
               </w:rPr>
-              <w:t>Difference</w:t>
+              <w:t>Gap</w:t>
             </w:r>
           </w:p>
         </w:tc>
@@ -37144,7 +37144,7 @@
               <w:rPr>
                 <w:b/>
               </w:rPr>
-              <w:t>Months inside</w:t>
+              <w:t>Stress months (n)</w:t>
             </w:r>
           </w:p>
         </w:tc>
@@ -40588,7 +40588,7 @@
           <w:i/>
           <w:sz w:val="16"/>
         </w:rPr>
-        <w:t>One-sided circular-shift permutation test; hypotheses and regimes fixed before the results by date were computed (D-40). Inside / outside: mean over months inside and outside the regime. Not corrected for the 24 comparisons: descriptive only. Source: edges-6.3/regime_tests.csv.</w:t>
+        <w:t>p-values come from rotating the monthly edge record against the calendar (circular shifts, one-sided). The regimes and the expected directions were written down before any dated result (D-40). The two month columns are averages over stress months and over all other months. These 24 rows are descriptive and not corrected for multiple testing. Source: edges-6.3/regime_tests.csv.</w:t>
       </w:r>
     </w:p>
     <w:p>
@@ -40599,7 +40599,7 @@
         <w:rPr>
           <w:b/>
         </w:rPr>
-        <w:t>T26. Persistence of the 15 edges over the 200 monthly selections</w:t>
+        <w:t>T26. How often, and for how long, each of the 15 edges was switched on</w:t>
       </w:r>
     </w:p>
     <w:tbl>
@@ -40638,7 +40638,7 @@
               <w:rPr>
                 <w:b/>
               </w:rPr>
-              <w:t>Cluster</w:t>
+              <w:t>Group</w:t>
             </w:r>
           </w:p>
         </w:tc>
@@ -40651,7 +40651,7 @@
               <w:rPr>
                 <w:b/>
               </w:rPr>
-              <w:t>Months active</w:t>
+              <w:t>Share of months on</w:t>
             </w:r>
           </w:p>
         </w:tc>
@@ -40664,7 +40664,7 @@
               <w:rPr>
                 <w:b/>
               </w:rPr>
-              <w:t>Switches</w:t>
+              <w:t>On/off changes</w:t>
             </w:r>
           </w:p>
         </w:tc>
@@ -40677,7 +40677,7 @@
               <w:rPr>
                 <w:b/>
               </w:rPr>
-              <w:t>Mean active spell (months)</w:t>
+              <w:t>Average run (months)</w:t>
             </w:r>
           </w:p>
         </w:tc>
@@ -41885,7 +41885,7 @@
         <w:rPr>
           <w:b/>
         </w:rPr>
-        <w:t>T27. Development scores of the tuned models</w:t>
+        <w:t>T27. Scores of the tuned models during development</w:t>
       </w:r>
     </w:p>
     <w:tbl>
@@ -41925,7 +41925,7 @@
               <w:rPr>
                 <w:b/>
               </w:rPr>
-              <w:t>Joint</w:t>
+              <w:t>Joint score</w:t>
             </w:r>
           </w:p>
         </w:tc>
@@ -41938,7 +41938,7 @@
               <w:rPr>
                 <w:b/>
               </w:rPr>
-              <w:t>Log-loss 1d</w:t>
+              <w:t>Log loss (1-day)</w:t>
             </w:r>
           </w:p>
         </w:tc>
@@ -41951,7 +41951,7 @@
               <w:rPr>
                 <w:b/>
               </w:rPr>
-              <w:t>Log-loss 5d</w:t>
+              <w:t>Log loss (5-day)</w:t>
             </w:r>
           </w:p>
         </w:tc>
@@ -41964,7 +41964,7 @@
               <w:rPr>
                 <w:b/>
               </w:rPr>
-              <w:t>QLIKE 1d</w:t>
+              <w:t>QLIKE (1-day)</w:t>
             </w:r>
           </w:p>
         </w:tc>
@@ -41977,7 +41977,7 @@
               <w:rPr>
                 <w:b/>
               </w:rPr>
-              <w:t>QLIKE 5d</w:t>
+              <w:t>QLIKE (5-day)</w:t>
             </w:r>
           </w:p>
         </w:tc>
@@ -42559,7 +42559,7 @@
           <w:i/>
           <w:sz w:val="16"/>
         </w:rPr>
-        <w:t>Out-of-fold losses at the 17 yearly tuning points, mean. Used for design decisions only; they are the best of the searched trials and so optimistic (about 0.01 in the joint loss). Source: phase4-aimdg/dev_scoreboard.csv.</w:t>
+        <w:t>Average out-of-fold losses over the 17 yearly tuning points. They guided design choices only, and because each is the best of many trials they flatter the models slightly (by roughly 0.01 in the joint score). Source: phase4-aimdg/dev_scoreboard.csv.</w:t>
       </w:r>
     </w:p>
     <w:sectPr>

</xml_diff>